<commit_message>
Embed result figures in manuscript with pharmacology-style captions
Adds 11 embedded figure panels (Figures 1-4, panels A/B/C) pulled from
the per-dataset and cross-dataset result PDFs already in the repo:
PCA, a representative volcano plot, and the TF-activity heatmap for
each of the three datasets (Figures 1-3), plus the cross-dataset
significance/consensus figures renumbered as 4A/4B. Each panel has a
caption stating what statistical method produced it (DESeq2/apeglm,
limma/eBayes, decoupleR ulm against CollecTRI, BH correction, etc.),
matching standard pharmacology-journal figure-legend conventions.
Author name/affiliation intentionally left as placeholders per request.

Co-Authored-By: Claude Sonnet 5 <noreply@anthropic.com>
</commit_message>
<xml_diff>
--- a/manuscript_draft.docx
+++ b/manuscript_draft.docx
@@ -158,6 +158,24 @@
           <w:i w:val="0"/>
         </w:rPr>
         <w:t>Three publicly available GEO datasets were selected to span three independent axes: species (human vs. mouse), injury etiology (metabolic vs. chemical-toxicant), and expression-profiling platform (RNA-seq vs. two distinct microarray platforms).</w:t>
+      </w:r>
+    </w:p>
+    <w:p>
+      <w:pPr>
+        <w:spacing w:before="200" w:after="80"/>
+      </w:pPr>
+      <w:r>
+        <w:rPr>
+          <w:b/>
+          <w:sz w:val="21"/>
+        </w:rPr>
+        <w:t xml:space="preserve">Table 1. </w:t>
+      </w:r>
+      <w:r>
+        <w:rPr>
+          <w:sz w:val="21"/>
+        </w:rPr>
+        <w:t>Public datasets reanalyzed in this study.</w:t>
       </w:r>
     </w:p>
     <w:tbl>
@@ -721,6 +739,24 @@
           <w:i w:val="0"/>
         </w:rPr>
         <w:t>Standard QC and filtering yielded 21,191 analyzable genes across 216 human samples (GSE135251), 41,345 transcript clusters across 18 mouse CCl4 samples (GSE222576), and 25,697 probes across 13 mouse TAA samples (GSE74605), with group sizes matching the expected experimental design in all three datasets (Table 1). Using the fixed, pre-registered significance threshold, all three datasets yielded a plausible biological pattern of increasing numbers of DEGs with more advanced/prolonged injury (Table 2).</w:t>
+      </w:r>
+    </w:p>
+    <w:p>
+      <w:pPr>
+        <w:spacing w:before="200" w:after="80"/>
+      </w:pPr>
+      <w:r>
+        <w:rPr>
+          <w:b/>
+          <w:sz w:val="21"/>
+        </w:rPr>
+        <w:t xml:space="preserve">Table 2. </w:t>
+      </w:r>
+      <w:r>
+        <w:rPr>
+          <w:sz w:val="21"/>
+        </w:rPr>
+        <w:t>Differentially expressed genes per dataset and contrast, using the pre-registered threshold (BH-adjusted p&lt;0.05, |log2 fold-change|&gt;1).</w:t>
       </w:r>
     </w:p>
     <w:tbl>
@@ -1293,7 +1329,556 @@
           <w:b w:val="0"/>
           <w:i w:val="0"/>
         </w:rPr>
-        <w:t>TF activity inference identified 703, 547, and 535 testable TFs in GSE135251, GSE222576, and GSE74605, respectively (after excluding UniProt-accession-only network entries), of which 518, 292, and 256 were significantly associated with progression within each dataset (BH-adjusted p&lt;0.05). In the mouse CCl4 dataset, multiple fibrogenic/EMT-associated TFs (Prrx1, Twist1, Sox9, Notch1) peaked sharply at the 6-week timepoint, coinciding with the timepoint of maximal DEG count; in the mouse TAA dataset, TGF-β/SMAD pathway members (Smad1, Smad4, Smad5, Smad9) formed a cluster increasing monotonically from the naive state through 6 weeks.</w:t>
+        <w:t>TF activity inference identified 703, 547, and 535 testable TFs in GSE135251, GSE222576, and GSE74605, respectively (after excluding UniProt-accession-only network entries), of which 518, 292, and 256 were significantly associated with progression within each dataset (BH-adjusted p&lt;0.05). In the mouse CCl4 dataset, multiple fibrogenic/EMT-associated TFs (Prrx1, Twist1, Sox9, Notch1) peaked sharply at the 6-week timepoint, coinciding with the timepoint of maximal DEG count; in the mouse TAA dataset, TGF-β/SMAD pathway members (Smad1, Smad4, Smad5, Smad9) formed a cluster increasing monotonically from the naive state through 6 weeks. Sample-level ordination, a representative differential-expression contrast, and the within-dataset TF activity landscape for each dataset are shown in Figures 1-3.</w:t>
+      </w:r>
+    </w:p>
+    <w:p>
+      <w:r>
+        <w:rPr>
+          <w:b/>
+          <w:i w:val="0"/>
+        </w:rPr>
+        <w:t>GSE135251 (human MASLD spectrum):</w:t>
+      </w:r>
+    </w:p>
+    <w:p>
+      <w:pPr>
+        <w:jc w:val="center"/>
+      </w:pPr>
+      <w:r>
+        <w:drawing>
+          <wp:inline xmlns:a="http://schemas.openxmlformats.org/drawingml/2006/main" xmlns:pic="http://schemas.openxmlformats.org/drawingml/2006/picture">
+            <wp:extent cx="5760720" cy="4114800"/>
+            <wp:docPr id="1" name="Picture 1"/>
+            <wp:cNvGraphicFramePr>
+              <a:graphicFrameLocks noChangeAspect="1"/>
+            </wp:cNvGraphicFramePr>
+            <a:graphic>
+              <a:graphicData uri="http://schemas.openxmlformats.org/drawingml/2006/picture">
+                <pic:pic>
+                  <pic:nvPicPr>
+                    <pic:cNvPr id="0" name="f1a_pca_human.png"/>
+                    <pic:cNvPicPr/>
+                  </pic:nvPicPr>
+                  <pic:blipFill>
+                    <a:blip r:embed="rId9"/>
+                    <a:stretch>
+                      <a:fillRect/>
+                    </a:stretch>
+                  </pic:blipFill>
+                  <pic:spPr>
+                    <a:xfrm>
+                      <a:off x="0" y="0"/>
+                      <a:ext cx="5760720" cy="4114800"/>
+                    </a:xfrm>
+                    <a:prstGeom prst="rect"/>
+                  </pic:spPr>
+                </pic:pic>
+              </a:graphicData>
+            </a:graphic>
+          </wp:inline>
+        </w:drawing>
+      </w:r>
+    </w:p>
+    <w:p>
+      <w:pPr>
+        <w:spacing w:after="280"/>
+        <w:jc w:val="center"/>
+      </w:pPr>
+      <w:r>
+        <w:rPr>
+          <w:b/>
+          <w:sz w:val="21"/>
+        </w:rPr>
+        <w:t xml:space="preserve">Figure 1A. </w:t>
+      </w:r>
+      <w:r>
+        <w:rPr>
+          <w:sz w:val="21"/>
+        </w:rPr>
+        <w:t>Principal component analysis of variance-stabilized transformed (VST) expression values across the four MASLD progression groups (GSE135251, n=216 liver biopsies). Principal components were computed on the 500 most variable genes using DESeq2's plotPCA(); percent variance explained is given on each axis.</w:t>
+      </w:r>
+    </w:p>
+    <w:p>
+      <w:pPr>
+        <w:jc w:val="center"/>
+      </w:pPr>
+      <w:r>
+        <w:drawing>
+          <wp:inline xmlns:a="http://schemas.openxmlformats.org/drawingml/2006/main" xmlns:pic="http://schemas.openxmlformats.org/drawingml/2006/picture">
+            <wp:extent cx="5760720" cy="5760720"/>
+            <wp:docPr id="2" name="Picture 2"/>
+            <wp:cNvGraphicFramePr>
+              <a:graphicFrameLocks noChangeAspect="1"/>
+            </wp:cNvGraphicFramePr>
+            <a:graphic>
+              <a:graphicData uri="http://schemas.openxmlformats.org/drawingml/2006/picture">
+                <pic:pic>
+                  <pic:nvPicPr>
+                    <pic:cNvPr id="0" name="f1b_volcano_human.png"/>
+                    <pic:cNvPicPr/>
+                  </pic:nvPicPr>
+                  <pic:blipFill>
+                    <a:blip r:embed="rId10"/>
+                    <a:stretch>
+                      <a:fillRect/>
+                    </a:stretch>
+                  </pic:blipFill>
+                  <pic:spPr>
+                    <a:xfrm>
+                      <a:off x="0" y="0"/>
+                      <a:ext cx="5760720" cy="5760720"/>
+                    </a:xfrm>
+                    <a:prstGeom prst="rect"/>
+                  </pic:spPr>
+                </pic:pic>
+              </a:graphicData>
+            </a:graphic>
+          </wp:inline>
+        </w:drawing>
+      </w:r>
+    </w:p>
+    <w:p>
+      <w:pPr>
+        <w:spacing w:after="280"/>
+        <w:jc w:val="center"/>
+      </w:pPr>
+      <w:r>
+        <w:rPr>
+          <w:b/>
+          <w:sz w:val="21"/>
+        </w:rPr>
+        <w:t xml:space="preserve">Figure 1B. </w:t>
+      </w:r>
+      <w:r>
+        <w:rPr>
+          <w:sz w:val="21"/>
+        </w:rPr>
+        <w:t>Volcano plot of differential expression, Advanced Fibrosis vs. Steatosis-only (GSE135251). log2 fold-changes are apeglm-shrunken DESeq2 estimates; the y-axis is the Benjamini-Hochberg-adjusted p-value. Dashed lines mark the pre-registered significance thresholds (padj &lt; 0.05, |log2FC| &gt; 1) used throughout this study.</w:t>
+      </w:r>
+    </w:p>
+    <w:p>
+      <w:pPr>
+        <w:jc w:val="center"/>
+      </w:pPr>
+      <w:r>
+        <w:drawing>
+          <wp:inline xmlns:a="http://schemas.openxmlformats.org/drawingml/2006/main" xmlns:pic="http://schemas.openxmlformats.org/drawingml/2006/picture">
+            <wp:extent cx="5760720" cy="7406640"/>
+            <wp:docPr id="3" name="Picture 3"/>
+            <wp:cNvGraphicFramePr>
+              <a:graphicFrameLocks noChangeAspect="1"/>
+            </wp:cNvGraphicFramePr>
+            <a:graphic>
+              <a:graphicData uri="http://schemas.openxmlformats.org/drawingml/2006/picture">
+                <pic:pic>
+                  <pic:nvPicPr>
+                    <pic:cNvPr id="0" name="f1c_heatmap_human.png"/>
+                    <pic:cNvPicPr/>
+                  </pic:nvPicPr>
+                  <pic:blipFill>
+                    <a:blip r:embed="rId11"/>
+                    <a:stretch>
+                      <a:fillRect/>
+                    </a:stretch>
+                  </pic:blipFill>
+                  <pic:spPr>
+                    <a:xfrm>
+                      <a:off x="0" y="0"/>
+                      <a:ext cx="5760720" cy="7406640"/>
+                    </a:xfrm>
+                    <a:prstGeom prst="rect"/>
+                  </pic:spPr>
+                </pic:pic>
+              </a:graphicData>
+            </a:graphic>
+          </wp:inline>
+        </w:drawing>
+      </w:r>
+    </w:p>
+    <w:p>
+      <w:pPr>
+        <w:spacing w:after="280"/>
+        <w:jc w:val="center"/>
+      </w:pPr>
+      <w:r>
+        <w:rPr>
+          <w:b/>
+          <w:sz w:val="21"/>
+        </w:rPr>
+        <w:t xml:space="preserve">Figure 1C. </w:t>
+      </w:r>
+      <w:r>
+        <w:rPr>
+          <w:sz w:val="21"/>
+        </w:rPr>
+        <w:t>Transcription factor activity across MASLD progression (GSE135251), restricted to TFs significantly associated with progression (one-way ANOVA on decoupleR univariate linear-model activity scores against the CollecTRI regulon, BH-adjusted p&lt;0.05; Methods 2.3-2.4). Values are row-wise z-scored group-mean activity; rows are hierarchically clustered (correlation distance, Ward.D2 linkage).</w:t>
+      </w:r>
+    </w:p>
+    <w:p>
+      <w:r>
+        <w:rPr>
+          <w:b/>
+          <w:i w:val="0"/>
+        </w:rPr>
+        <w:t>GSE222576 (mouse CCl4 time course):</w:t>
+      </w:r>
+    </w:p>
+    <w:p>
+      <w:pPr>
+        <w:jc w:val="center"/>
+      </w:pPr>
+      <w:r>
+        <w:drawing>
+          <wp:inline xmlns:a="http://schemas.openxmlformats.org/drawingml/2006/main" xmlns:pic="http://schemas.openxmlformats.org/drawingml/2006/picture">
+            <wp:extent cx="5760720" cy="4114800"/>
+            <wp:docPr id="4" name="Picture 4"/>
+            <wp:cNvGraphicFramePr>
+              <a:graphicFrameLocks noChangeAspect="1"/>
+            </wp:cNvGraphicFramePr>
+            <a:graphic>
+              <a:graphicData uri="http://schemas.openxmlformats.org/drawingml/2006/picture">
+                <pic:pic>
+                  <pic:nvPicPr>
+                    <pic:cNvPr id="0" name="f2a_pca_ccl4.png"/>
+                    <pic:cNvPicPr/>
+                  </pic:nvPicPr>
+                  <pic:blipFill>
+                    <a:blip r:embed="rId12"/>
+                    <a:stretch>
+                      <a:fillRect/>
+                    </a:stretch>
+                  </pic:blipFill>
+                  <pic:spPr>
+                    <a:xfrm>
+                      <a:off x="0" y="0"/>
+                      <a:ext cx="5760720" cy="4114800"/>
+                    </a:xfrm>
+                    <a:prstGeom prst="rect"/>
+                  </pic:spPr>
+                </pic:pic>
+              </a:graphicData>
+            </a:graphic>
+          </wp:inline>
+        </w:drawing>
+      </w:r>
+    </w:p>
+    <w:p>
+      <w:pPr>
+        <w:spacing w:after="280"/>
+        <w:jc w:val="center"/>
+      </w:pPr>
+      <w:r>
+        <w:rPr>
+          <w:b/>
+          <w:sz w:val="21"/>
+        </w:rPr>
+        <w:t xml:space="preserve">Figure 2A. </w:t>
+      </w:r>
+      <w:r>
+        <w:rPr>
+          <w:sz w:val="21"/>
+        </w:rPr>
+        <w:t>Principal component analysis of RMA-normalized expression values across the CCl4 time course (GSE222576, n=18; Control and 2/4/6/8/10 weeks, n=3/group).</w:t>
+      </w:r>
+    </w:p>
+    <w:p>
+      <w:pPr>
+        <w:jc w:val="center"/>
+      </w:pPr>
+      <w:r>
+        <w:drawing>
+          <wp:inline xmlns:a="http://schemas.openxmlformats.org/drawingml/2006/main" xmlns:pic="http://schemas.openxmlformats.org/drawingml/2006/picture">
+            <wp:extent cx="5760720" cy="5760720"/>
+            <wp:docPr id="5" name="Picture 5"/>
+            <wp:cNvGraphicFramePr>
+              <a:graphicFrameLocks noChangeAspect="1"/>
+            </wp:cNvGraphicFramePr>
+            <a:graphic>
+              <a:graphicData uri="http://schemas.openxmlformats.org/drawingml/2006/picture">
+                <pic:pic>
+                  <pic:nvPicPr>
+                    <pic:cNvPr id="0" name="f2b_volcano_ccl4.png"/>
+                    <pic:cNvPicPr/>
+                  </pic:nvPicPr>
+                  <pic:blipFill>
+                    <a:blip r:embed="rId13"/>
+                    <a:stretch>
+                      <a:fillRect/>
+                    </a:stretch>
+                  </pic:blipFill>
+                  <pic:spPr>
+                    <a:xfrm>
+                      <a:off x="0" y="0"/>
+                      <a:ext cx="5760720" cy="5760720"/>
+                    </a:xfrm>
+                    <a:prstGeom prst="rect"/>
+                  </pic:spPr>
+                </pic:pic>
+              </a:graphicData>
+            </a:graphic>
+          </wp:inline>
+        </w:drawing>
+      </w:r>
+    </w:p>
+    <w:p>
+      <w:pPr>
+        <w:spacing w:after="280"/>
+        <w:jc w:val="center"/>
+      </w:pPr>
+      <w:r>
+        <w:rPr>
+          <w:b/>
+          <w:sz w:val="21"/>
+        </w:rPr>
+        <w:t xml:space="preserve">Figure 2B. </w:t>
+      </w:r>
+      <w:r>
+        <w:rPr>
+          <w:sz w:val="21"/>
+        </w:rPr>
+        <w:t>Volcano plot of differential expression, CCl4 6 weeks vs. Control (GSE222576) -- the timepoint with the largest number of significant DEGs (Table 2). Statistics are limma/eBayes moderated t-test log-fold-changes and BH-adjusted p-values; dashed lines as in Figure 1B.</w:t>
+      </w:r>
+    </w:p>
+    <w:p>
+      <w:pPr>
+        <w:jc w:val="center"/>
+      </w:pPr>
+      <w:r>
+        <w:drawing>
+          <wp:inline xmlns:a="http://schemas.openxmlformats.org/drawingml/2006/main" xmlns:pic="http://schemas.openxmlformats.org/drawingml/2006/picture">
+            <wp:extent cx="5760720" cy="7406640"/>
+            <wp:docPr id="6" name="Picture 6"/>
+            <wp:cNvGraphicFramePr>
+              <a:graphicFrameLocks noChangeAspect="1"/>
+            </wp:cNvGraphicFramePr>
+            <a:graphic>
+              <a:graphicData uri="http://schemas.openxmlformats.org/drawingml/2006/picture">
+                <pic:pic>
+                  <pic:nvPicPr>
+                    <pic:cNvPr id="0" name="f2c_heatmap_ccl4.png"/>
+                    <pic:cNvPicPr/>
+                  </pic:nvPicPr>
+                  <pic:blipFill>
+                    <a:blip r:embed="rId14"/>
+                    <a:stretch>
+                      <a:fillRect/>
+                    </a:stretch>
+                  </pic:blipFill>
+                  <pic:spPr>
+                    <a:xfrm>
+                      <a:off x="0" y="0"/>
+                      <a:ext cx="5760720" cy="7406640"/>
+                    </a:xfrm>
+                    <a:prstGeom prst="rect"/>
+                  </pic:spPr>
+                </pic:pic>
+              </a:graphicData>
+            </a:graphic>
+          </wp:inline>
+        </w:drawing>
+      </w:r>
+    </w:p>
+    <w:p>
+      <w:pPr>
+        <w:spacing w:after="280"/>
+        <w:jc w:val="center"/>
+      </w:pPr>
+      <w:r>
+        <w:rPr>
+          <w:b/>
+          <w:sz w:val="21"/>
+        </w:rPr>
+        <w:t xml:space="preserve">Figure 2C. </w:t>
+      </w:r>
+      <w:r>
+        <w:rPr>
+          <w:sz w:val="21"/>
+        </w:rPr>
+        <w:t>Transcription factor activity across the CCl4 time course (GSE222576), restricted to significantly associated TFs (BH-adjusted p&lt;0.05); computed and displayed as in Figure 1C. Note the sharp peak in fibrogenic/EMT-associated TF activity at 6 weeks (Section 3.1).</w:t>
+      </w:r>
+    </w:p>
+    <w:p>
+      <w:r>
+        <w:rPr>
+          <w:b/>
+          <w:i w:val="0"/>
+        </w:rPr>
+        <w:t>GSE74605 (mouse TAA time course):</w:t>
+      </w:r>
+    </w:p>
+    <w:p>
+      <w:pPr>
+        <w:jc w:val="center"/>
+      </w:pPr>
+      <w:r>
+        <w:drawing>
+          <wp:inline xmlns:a="http://schemas.openxmlformats.org/drawingml/2006/main" xmlns:pic="http://schemas.openxmlformats.org/drawingml/2006/picture">
+            <wp:extent cx="5760720" cy="4114800"/>
+            <wp:docPr id="7" name="Picture 7"/>
+            <wp:cNvGraphicFramePr>
+              <a:graphicFrameLocks noChangeAspect="1"/>
+            </wp:cNvGraphicFramePr>
+            <a:graphic>
+              <a:graphicData uri="http://schemas.openxmlformats.org/drawingml/2006/picture">
+                <pic:pic>
+                  <pic:nvPicPr>
+                    <pic:cNvPr id="0" name="f3a_pca_taa.png"/>
+                    <pic:cNvPicPr/>
+                  </pic:nvPicPr>
+                  <pic:blipFill>
+                    <a:blip r:embed="rId15"/>
+                    <a:stretch>
+                      <a:fillRect/>
+                    </a:stretch>
+                  </pic:blipFill>
+                  <pic:spPr>
+                    <a:xfrm>
+                      <a:off x="0" y="0"/>
+                      <a:ext cx="5760720" cy="4114800"/>
+                    </a:xfrm>
+                    <a:prstGeom prst="rect"/>
+                  </pic:spPr>
+                </pic:pic>
+              </a:graphicData>
+            </a:graphic>
+          </wp:inline>
+        </w:drawing>
+      </w:r>
+    </w:p>
+    <w:p>
+      <w:pPr>
+        <w:spacing w:after="280"/>
+        <w:jc w:val="center"/>
+      </w:pPr>
+      <w:r>
+        <w:rPr>
+          <w:b/>
+          <w:sz w:val="21"/>
+        </w:rPr>
+        <w:t xml:space="preserve">Figure 3A. </w:t>
+      </w:r>
+      <w:r>
+        <w:rPr>
+          <w:sz w:val="21"/>
+        </w:rPr>
+        <w:t>Principal component analysis of quantile-normalized expression values across the TAA time course (GSE74605, n=13; Naive and 1/4/6 weeks, n=3-4/group).</w:t>
+      </w:r>
+    </w:p>
+    <w:p>
+      <w:pPr>
+        <w:jc w:val="center"/>
+      </w:pPr>
+      <w:r>
+        <w:drawing>
+          <wp:inline xmlns:a="http://schemas.openxmlformats.org/drawingml/2006/main" xmlns:pic="http://schemas.openxmlformats.org/drawingml/2006/picture">
+            <wp:extent cx="5760720" cy="5760720"/>
+            <wp:docPr id="8" name="Picture 8"/>
+            <wp:cNvGraphicFramePr>
+              <a:graphicFrameLocks noChangeAspect="1"/>
+            </wp:cNvGraphicFramePr>
+            <a:graphic>
+              <a:graphicData uri="http://schemas.openxmlformats.org/drawingml/2006/picture">
+                <pic:pic>
+                  <pic:nvPicPr>
+                    <pic:cNvPr id="0" name="f3b_volcano_taa.png"/>
+                    <pic:cNvPicPr/>
+                  </pic:nvPicPr>
+                  <pic:blipFill>
+                    <a:blip r:embed="rId16"/>
+                    <a:stretch>
+                      <a:fillRect/>
+                    </a:stretch>
+                  </pic:blipFill>
+                  <pic:spPr>
+                    <a:xfrm>
+                      <a:off x="0" y="0"/>
+                      <a:ext cx="5760720" cy="5760720"/>
+                    </a:xfrm>
+                    <a:prstGeom prst="rect"/>
+                  </pic:spPr>
+                </pic:pic>
+              </a:graphicData>
+            </a:graphic>
+          </wp:inline>
+        </w:drawing>
+      </w:r>
+    </w:p>
+    <w:p>
+      <w:pPr>
+        <w:spacing w:after="280"/>
+        <w:jc w:val="center"/>
+      </w:pPr>
+      <w:r>
+        <w:rPr>
+          <w:b/>
+          <w:sz w:val="21"/>
+        </w:rPr>
+        <w:t xml:space="preserve">Figure 3B. </w:t>
+      </w:r>
+      <w:r>
+        <w:rPr>
+          <w:sz w:val="21"/>
+        </w:rPr>
+        <w:t>Volcano plot of differential expression, TAA 6 weeks vs. Naive (GSE74605) -- the timepoint with the largest number of significant DEGs (Table 2). Statistics and thresholds as in Figure 2B.</w:t>
+      </w:r>
+    </w:p>
+    <w:p>
+      <w:pPr>
+        <w:jc w:val="center"/>
+      </w:pPr>
+      <w:r>
+        <w:drawing>
+          <wp:inline xmlns:a="http://schemas.openxmlformats.org/drawingml/2006/main" xmlns:pic="http://schemas.openxmlformats.org/drawingml/2006/picture">
+            <wp:extent cx="5760720" cy="7406640"/>
+            <wp:docPr id="9" name="Picture 9"/>
+            <wp:cNvGraphicFramePr>
+              <a:graphicFrameLocks noChangeAspect="1"/>
+            </wp:cNvGraphicFramePr>
+            <a:graphic>
+              <a:graphicData uri="http://schemas.openxmlformats.org/drawingml/2006/picture">
+                <pic:pic>
+                  <pic:nvPicPr>
+                    <pic:cNvPr id="0" name="f3c_heatmap_taa.png"/>
+                    <pic:cNvPicPr/>
+                  </pic:nvPicPr>
+                  <pic:blipFill>
+                    <a:blip r:embed="rId17"/>
+                    <a:stretch>
+                      <a:fillRect/>
+                    </a:stretch>
+                  </pic:blipFill>
+                  <pic:spPr>
+                    <a:xfrm>
+                      <a:off x="0" y="0"/>
+                      <a:ext cx="5760720" cy="7406640"/>
+                    </a:xfrm>
+                    <a:prstGeom prst="rect"/>
+                  </pic:spPr>
+                </pic:pic>
+              </a:graphicData>
+            </a:graphic>
+          </wp:inline>
+        </w:drawing>
+      </w:r>
+    </w:p>
+    <w:p>
+      <w:pPr>
+        <w:spacing w:after="280"/>
+        <w:jc w:val="center"/>
+      </w:pPr>
+      <w:r>
+        <w:rPr>
+          <w:b/>
+          <w:sz w:val="21"/>
+        </w:rPr>
+        <w:t xml:space="preserve">Figure 3C. </w:t>
+      </w:r>
+      <w:r>
+        <w:rPr>
+          <w:sz w:val="21"/>
+        </w:rPr>
+        <w:t>Transcription factor activity across the TAA time course (GSE74605), restricted to significantly associated TFs (BH-adjusted p&lt;0.05); computed and displayed as in Figure 1C. The TGF-β/SMAD cluster (Smad1/4/5/9) increasing monotonically with duration of exposure (Section 3.1) is visible here.</w:t>
       </w:r>
     </w:p>
     <w:p>
@@ -1310,7 +1895,25 @@
           <w:b w:val="0"/>
           <w:i w:val="0"/>
         </w:rPr>
-        <w:t>After ortholog-based matching (Methods 2.5), 499 TFs were testable in all three datasets. Of these, 449 reached a nominally significant Fisher-combined p-value, but only 101 were independently significant in all three datasets, and 54 additionally satisfied the direction-concordance criterion, forming the consensus set used for downstream prioritization (Figure 1; full list in Supplementary Table S1). The top 15 consensus TFs by Fisher-combined p-value are shown in Table 3 and were identical, at this rank, to those obtained using a simpler symbol-case-conversion match (Methods 2.5; Section 3.2 note below), indicating the headline result is not an artifact of the matching method.</w:t>
+        <w:t>After ortholog-based matching (Methods 2.5), 499 TFs were testable in all three datasets. Of these, 449 reached a nominally significant Fisher-combined p-value, but only 101 were independently significant in all three datasets, and 54 additionally satisfied the direction-concordance criterion, forming the consensus set used for downstream prioritization (Figure 4A; full list in Supplementary Table S1). The top 15 consensus TFs by Fisher-combined p-value are shown in Table 3 and were identical, at this rank, to those obtained using a simpler symbol-case-conversion match (Methods 2.5; Section 3.2 note below), indicating the headline result is not an artifact of the matching method.</w:t>
+      </w:r>
+    </w:p>
+    <w:p>
+      <w:pPr>
+        <w:spacing w:before="200" w:after="80"/>
+      </w:pPr>
+      <w:r>
+        <w:rPr>
+          <w:b/>
+          <w:sz w:val="21"/>
+        </w:rPr>
+        <w:t xml:space="preserve">Table 3. </w:t>
+      </w:r>
+      <w:r>
+        <w:rPr>
+          <w:sz w:val="21"/>
+        </w:rPr>
+        <w:t>Top 15 consensus transcription factors, ranked by Fisher-combined padj.</w:t>
       </w:r>
     </w:p>
     <w:tbl>
@@ -2919,6 +3522,64 @@
     </w:p>
     <w:p>
       <w:pPr>
+        <w:jc w:val="center"/>
+      </w:pPr>
+      <w:r>
+        <w:drawing>
+          <wp:inline xmlns:a="http://schemas.openxmlformats.org/drawingml/2006/main" xmlns:pic="http://schemas.openxmlformats.org/drawingml/2006/picture">
+            <wp:extent cx="5760720" cy="3456432"/>
+            <wp:docPr id="10" name="Picture 10"/>
+            <wp:cNvGraphicFramePr>
+              <a:graphicFrameLocks noChangeAspect="1"/>
+            </wp:cNvGraphicFramePr>
+            <a:graphic>
+              <a:graphicData uri="http://schemas.openxmlformats.org/drawingml/2006/picture">
+                <pic:pic>
+                  <pic:nvPicPr>
+                    <pic:cNvPr id="0" name="fig1_bar.png"/>
+                    <pic:cNvPicPr/>
+                  </pic:nvPicPr>
+                  <pic:blipFill>
+                    <a:blip r:embed="rId18"/>
+                    <a:stretch>
+                      <a:fillRect/>
+                    </a:stretch>
+                  </pic:blipFill>
+                  <pic:spPr>
+                    <a:xfrm>
+                      <a:off x="0" y="0"/>
+                      <a:ext cx="5760720" cy="3456432"/>
+                    </a:xfrm>
+                    <a:prstGeom prst="rect"/>
+                  </pic:spPr>
+                </pic:pic>
+              </a:graphicData>
+            </a:graphic>
+          </wp:inline>
+        </w:drawing>
+      </w:r>
+    </w:p>
+    <w:p>
+      <w:pPr>
+        <w:spacing w:after="280"/>
+        <w:jc w:val="center"/>
+      </w:pPr>
+      <w:r>
+        <w:rPr>
+          <w:b/>
+          <w:sz w:val="21"/>
+        </w:rPr>
+        <w:t xml:space="preserve">Figure 4A. </w:t>
+      </w:r>
+      <w:r>
+        <w:rPr>
+          <w:sz w:val="21"/>
+        </w:rPr>
+        <w:t>Statistical significance of the top 15 consensus transcription factors in each of the three datasets. Bars show -log10(BH-adjusted p-value) within each dataset, computed from the within-dataset ANOVA described in Methods 2.4 (BH correction applied separately per dataset); the dashed line marks padj = 0.05. Every bar for every listed TF clears the significance threshold in all three datasets independently.</w:t>
+      </w:r>
+    </w:p>
+    <w:p>
+      <w:pPr>
         <w:pStyle w:val="Heading2"/>
       </w:pPr>
       <w:r>
@@ -2932,6 +3593,64 @@
           <w:i w:val="0"/>
         </w:rPr>
         <w:t>Three of the top 15 consensus TFs are direct components of the canonical TGF-β/SMAD signaling axis: SMAD3, the principal pro-fibrotic effector of TGF-β receptor signaling, increased with fibrosis progression in all three datasets, while SMAD6 and SMAD7, both negative-feedback inhibitors of the same pathway, decreased with progression in all three datasets. This pattern -- loss of pathway-intrinsic negative feedback occurring together with increased activity of the pro-fibrotic effector -- constitutes a mechanistically self-consistent signature that was recovered independently, without pathway-level supervision, in a human metabolic-disease cohort and two mechanistically distinct mouse chemical-injury models, supporting the biological validity of the consensus-filtering approach.</w:t>
+      </w:r>
+    </w:p>
+    <w:p>
+      <w:pPr>
+        <w:jc w:val="center"/>
+      </w:pPr>
+      <w:r>
+        <w:drawing>
+          <wp:inline xmlns:a="http://schemas.openxmlformats.org/drawingml/2006/main" xmlns:pic="http://schemas.openxmlformats.org/drawingml/2006/picture">
+            <wp:extent cx="5760720" cy="3142211"/>
+            <wp:docPr id="11" name="Picture 11"/>
+            <wp:cNvGraphicFramePr>
+              <a:graphicFrameLocks noChangeAspect="1"/>
+            </wp:cNvGraphicFramePr>
+            <a:graphic>
+              <a:graphicData uri="http://schemas.openxmlformats.org/drawingml/2006/picture">
+                <pic:pic>
+                  <pic:nvPicPr>
+                    <pic:cNvPr id="0" name="fig2_heatmap.png"/>
+                    <pic:cNvPicPr/>
+                  </pic:nvPicPr>
+                  <pic:blipFill>
+                    <a:blip r:embed="rId19"/>
+                    <a:stretch>
+                      <a:fillRect/>
+                    </a:stretch>
+                  </pic:blipFill>
+                  <pic:spPr>
+                    <a:xfrm>
+                      <a:off x="0" y="0"/>
+                      <a:ext cx="5760720" cy="3142211"/>
+                    </a:xfrm>
+                    <a:prstGeom prst="rect"/>
+                  </pic:spPr>
+                </pic:pic>
+              </a:graphicData>
+            </a:graphic>
+          </wp:inline>
+        </w:drawing>
+      </w:r>
+    </w:p>
+    <w:p>
+      <w:pPr>
+        <w:spacing w:after="280"/>
+        <w:jc w:val="center"/>
+      </w:pPr>
+      <w:r>
+        <w:rPr>
+          <w:b/>
+          <w:sz w:val="21"/>
+        </w:rPr>
+        <w:t xml:space="preserve">Figure 4B. </w:t>
+      </w:r>
+      <w:r>
+        <w:rPr>
+          <w:sz w:val="21"/>
+        </w:rPr>
+        <w:t>Activity of the top 15 consensus transcription factors across all three datasets, arranged by disease/injury progression (left to right within each block: human Normal-to-Advanced Fibrosis; mouse CCl4 Control-to-10 weeks; mouse TAA Naive-to-6 weeks). Color scale is a row-wise z-score computed independently within each dataset (Methods 2.6) to prevent the platform with the larger absolute activity range from dominating the display. The SMAD6/SMAD7/SMAD3 pattern described in Section 3.3 is visible as the top and bottom row clusters, respectively.</w:t>
       </w:r>
     </w:p>
     <w:p>
@@ -2974,7 +3693,25 @@
           <w:b w:val="0"/>
           <w:i w:val="0"/>
         </w:rPr>
-        <w:t>A systematic literature re-verification (Methods 2.6), however, showed that ARID1A is not uncharacterized in the liver as initially assumed. Hepatocyte-specific Arid1a-knockout mice develop worse high-fat-diet-induced steatosis and fibrosis (Moore et al., Hepatology 2019), and Arid1a mutation suppresses protective TGF-β-Smad4 signaling in cholangiocytes, promoting cholangiocarcinoma (Guo et al., Cell Reports 2022) -- both findings indicate a protective role for ARID1A in liver epithelial cells (hepatocytes, cholangiocytes), the opposite of a simple "ARID1A promotes fibrosis" reading. Our own data show ARID1A activity increasing with fibrosis progression in all three datasets (concordant direction = +1), which is compatible with either (i) a bulk-tissue cell-composition confound, in which the rising fraction of activated HSCs in whole-tissue RNA as fibrosis progresses inflates the apparent activity of any HSC-enriched regulon target set independent of any true regulatory change, or (ii) a genuine, cell-type-opposite function, whereby ARID1A is protective in hepatocytes/cholangiocytes but pro-fibrotic when acting cell-autonomously within HSCs. Critically, neither published study tested ARID1A directly in HSCs, leaving this specific, narrower question open and experimentally tractable (Section 5).</w:t>
+        <w:t>A systematic literature re-verification (Methods 2.6), however, showed that ARID1A is not uncharacterized in the liver as initially assumed. Hepatocyte-specific Arid1a-knockout mice develop worse high-fat-diet-induced steatosis and fibrosis (Moore et al., Hepatology 2019), and Arid1a mutation suppresses protective TGF-β-Smad4 signaling in cholangiocytes, promoting cholangiocarcinoma (Guo et al., Cell Reports 2022) -- both findings indicate a protective role for ARID1A in liver epithelial cells (hepatocytes, cholangiocytes), the opposite of a simple "ARID1A promotes fibrosis" reading. Our own data show ARID1A activity increasing with fibrosis progression in all three datasets (concordant direction = +1), which is compatible with either (i) a bulk-tissue cell-composition confound, in which the rising fraction of activated HSCs in whole-tissue RNA as fibrosis progresses inflates the apparent activity of any HSC-enriched regulon target set independent of any true regulatory change, or (ii) a genuine, cell-type-opposite function, whereby ARID1A is protective in hepatocytes/cholangiocytes but pro-fibrotic when acting cell-autonomously within HSCs. Critically, neither published study tested ARID1A directly in HSCs, leaving this specific, narrower question open and experimentally tractable (Section 6).</w:t>
+      </w:r>
+    </w:p>
+    <w:p>
+      <w:pPr>
+        <w:spacing w:before="200" w:after="80"/>
+      </w:pPr>
+      <w:r>
+        <w:rPr>
+          <w:b/>
+          <w:sz w:val="21"/>
+        </w:rPr>
+        <w:t xml:space="preserve">Table 4. </w:t>
+      </w:r>
+      <w:r>
+        <w:rPr>
+          <w:sz w:val="21"/>
+        </w:rPr>
+        <w:t>Existing literature evidence for SMARCA4 and ARID1A, by cell type.</w:t>
       </w:r>
     </w:p>
     <w:tbl>
@@ -3358,7 +4095,7 @@
           <w:b w:val="0"/>
           <w:i w:val="0"/>
         </w:rPr>
-        <w:t>All analysis code, intermediate result files, figures, the full 54-TF consensus table, the literature/druggability triage, and the experimental validation plan are publicly available at github.com/bioinform25/pharmacology2254. Public datasets analyzed are available from GEO under accessions GSE135251, GSE222576, and GSE74605.</w:t>
+        <w:t>All analysis code, intermediate result files, figures, the full 54-TF consensus table, the literature/druggability triage, and the experimental validation plan are publicly available at github.com/bioinform25/pharmacology2254. Public datasets analyzed are available from GEO under accessions GSE135251, GSE222576, and GSE74605. Figures 1B/2B/3B show one representative differential-expression contrast per dataset (the one with the most significant DEGs); volcano plots for every individual timepoint contrast (2/4/6/8/10 weeks for GSE222576; 1/4/6 weeks for GSE74605; both GSE135251 contrasts) are provided as individual PDF files under each dataset's figures/ directory in the repository.</w:t>
       </w:r>
     </w:p>
     <w:p>

</xml_diff>

<commit_message>
Embed result figures in manuscript with pharmacology-style captions (#5)
Embeds 11 figure panels (Figures 1-4, A/B/C) from the existing result PDFs into manuscript_draft.docx, with pharmacology-style captions stating the method behind each panel.
</commit_message>
<xml_diff>
--- a/manuscript_draft.docx
+++ b/manuscript_draft.docx
@@ -158,6 +158,24 @@
           <w:i w:val="0"/>
         </w:rPr>
         <w:t>Three publicly available GEO datasets were selected to span three independent axes: species (human vs. mouse), injury etiology (metabolic vs. chemical-toxicant), and expression-profiling platform (RNA-seq vs. two distinct microarray platforms).</w:t>
+      </w:r>
+    </w:p>
+    <w:p>
+      <w:pPr>
+        <w:spacing w:before="200" w:after="80"/>
+      </w:pPr>
+      <w:r>
+        <w:rPr>
+          <w:b/>
+          <w:sz w:val="21"/>
+        </w:rPr>
+        <w:t xml:space="preserve">Table 1. </w:t>
+      </w:r>
+      <w:r>
+        <w:rPr>
+          <w:sz w:val="21"/>
+        </w:rPr>
+        <w:t>Public datasets reanalyzed in this study.</w:t>
       </w:r>
     </w:p>
     <w:tbl>
@@ -721,6 +739,24 @@
           <w:i w:val="0"/>
         </w:rPr>
         <w:t>Standard QC and filtering yielded 21,191 analyzable genes across 216 human samples (GSE135251), 41,345 transcript clusters across 18 mouse CCl4 samples (GSE222576), and 25,697 probes across 13 mouse TAA samples (GSE74605), with group sizes matching the expected experimental design in all three datasets (Table 1). Using the fixed, pre-registered significance threshold, all three datasets yielded a plausible biological pattern of increasing numbers of DEGs with more advanced/prolonged injury (Table 2).</w:t>
+      </w:r>
+    </w:p>
+    <w:p>
+      <w:pPr>
+        <w:spacing w:before="200" w:after="80"/>
+      </w:pPr>
+      <w:r>
+        <w:rPr>
+          <w:b/>
+          <w:sz w:val="21"/>
+        </w:rPr>
+        <w:t xml:space="preserve">Table 2. </w:t>
+      </w:r>
+      <w:r>
+        <w:rPr>
+          <w:sz w:val="21"/>
+        </w:rPr>
+        <w:t>Differentially expressed genes per dataset and contrast, using the pre-registered threshold (BH-adjusted p&lt;0.05, |log2 fold-change|&gt;1).</w:t>
       </w:r>
     </w:p>
     <w:tbl>
@@ -1293,7 +1329,556 @@
           <w:b w:val="0"/>
           <w:i w:val="0"/>
         </w:rPr>
-        <w:t>TF activity inference identified 703, 547, and 535 testable TFs in GSE135251, GSE222576, and GSE74605, respectively (after excluding UniProt-accession-only network entries), of which 518, 292, and 256 were significantly associated with progression within each dataset (BH-adjusted p&lt;0.05). In the mouse CCl4 dataset, multiple fibrogenic/EMT-associated TFs (Prrx1, Twist1, Sox9, Notch1) peaked sharply at the 6-week timepoint, coinciding with the timepoint of maximal DEG count; in the mouse TAA dataset, TGF-β/SMAD pathway members (Smad1, Smad4, Smad5, Smad9) formed a cluster increasing monotonically from the naive state through 6 weeks.</w:t>
+        <w:t>TF activity inference identified 703, 547, and 535 testable TFs in GSE135251, GSE222576, and GSE74605, respectively (after excluding UniProt-accession-only network entries), of which 518, 292, and 256 were significantly associated with progression within each dataset (BH-adjusted p&lt;0.05). In the mouse CCl4 dataset, multiple fibrogenic/EMT-associated TFs (Prrx1, Twist1, Sox9, Notch1) peaked sharply at the 6-week timepoint, coinciding with the timepoint of maximal DEG count; in the mouse TAA dataset, TGF-β/SMAD pathway members (Smad1, Smad4, Smad5, Smad9) formed a cluster increasing monotonically from the naive state through 6 weeks. Sample-level ordination, a representative differential-expression contrast, and the within-dataset TF activity landscape for each dataset are shown in Figures 1-3.</w:t>
+      </w:r>
+    </w:p>
+    <w:p>
+      <w:r>
+        <w:rPr>
+          <w:b/>
+          <w:i w:val="0"/>
+        </w:rPr>
+        <w:t>GSE135251 (human MASLD spectrum):</w:t>
+      </w:r>
+    </w:p>
+    <w:p>
+      <w:pPr>
+        <w:jc w:val="center"/>
+      </w:pPr>
+      <w:r>
+        <w:drawing>
+          <wp:inline xmlns:a="http://schemas.openxmlformats.org/drawingml/2006/main" xmlns:pic="http://schemas.openxmlformats.org/drawingml/2006/picture">
+            <wp:extent cx="5760720" cy="4114800"/>
+            <wp:docPr id="1" name="Picture 1"/>
+            <wp:cNvGraphicFramePr>
+              <a:graphicFrameLocks noChangeAspect="1"/>
+            </wp:cNvGraphicFramePr>
+            <a:graphic>
+              <a:graphicData uri="http://schemas.openxmlformats.org/drawingml/2006/picture">
+                <pic:pic>
+                  <pic:nvPicPr>
+                    <pic:cNvPr id="0" name="f1a_pca_human.png"/>
+                    <pic:cNvPicPr/>
+                  </pic:nvPicPr>
+                  <pic:blipFill>
+                    <a:blip r:embed="rId9"/>
+                    <a:stretch>
+                      <a:fillRect/>
+                    </a:stretch>
+                  </pic:blipFill>
+                  <pic:spPr>
+                    <a:xfrm>
+                      <a:off x="0" y="0"/>
+                      <a:ext cx="5760720" cy="4114800"/>
+                    </a:xfrm>
+                    <a:prstGeom prst="rect"/>
+                  </pic:spPr>
+                </pic:pic>
+              </a:graphicData>
+            </a:graphic>
+          </wp:inline>
+        </w:drawing>
+      </w:r>
+    </w:p>
+    <w:p>
+      <w:pPr>
+        <w:spacing w:after="280"/>
+        <w:jc w:val="center"/>
+      </w:pPr>
+      <w:r>
+        <w:rPr>
+          <w:b/>
+          <w:sz w:val="21"/>
+        </w:rPr>
+        <w:t xml:space="preserve">Figure 1A. </w:t>
+      </w:r>
+      <w:r>
+        <w:rPr>
+          <w:sz w:val="21"/>
+        </w:rPr>
+        <w:t>Principal component analysis of variance-stabilized transformed (VST) expression values across the four MASLD progression groups (GSE135251, n=216 liver biopsies). Principal components were computed on the 500 most variable genes using DESeq2's plotPCA(); percent variance explained is given on each axis.</w:t>
+      </w:r>
+    </w:p>
+    <w:p>
+      <w:pPr>
+        <w:jc w:val="center"/>
+      </w:pPr>
+      <w:r>
+        <w:drawing>
+          <wp:inline xmlns:a="http://schemas.openxmlformats.org/drawingml/2006/main" xmlns:pic="http://schemas.openxmlformats.org/drawingml/2006/picture">
+            <wp:extent cx="5760720" cy="5760720"/>
+            <wp:docPr id="2" name="Picture 2"/>
+            <wp:cNvGraphicFramePr>
+              <a:graphicFrameLocks noChangeAspect="1"/>
+            </wp:cNvGraphicFramePr>
+            <a:graphic>
+              <a:graphicData uri="http://schemas.openxmlformats.org/drawingml/2006/picture">
+                <pic:pic>
+                  <pic:nvPicPr>
+                    <pic:cNvPr id="0" name="f1b_volcano_human.png"/>
+                    <pic:cNvPicPr/>
+                  </pic:nvPicPr>
+                  <pic:blipFill>
+                    <a:blip r:embed="rId10"/>
+                    <a:stretch>
+                      <a:fillRect/>
+                    </a:stretch>
+                  </pic:blipFill>
+                  <pic:spPr>
+                    <a:xfrm>
+                      <a:off x="0" y="0"/>
+                      <a:ext cx="5760720" cy="5760720"/>
+                    </a:xfrm>
+                    <a:prstGeom prst="rect"/>
+                  </pic:spPr>
+                </pic:pic>
+              </a:graphicData>
+            </a:graphic>
+          </wp:inline>
+        </w:drawing>
+      </w:r>
+    </w:p>
+    <w:p>
+      <w:pPr>
+        <w:spacing w:after="280"/>
+        <w:jc w:val="center"/>
+      </w:pPr>
+      <w:r>
+        <w:rPr>
+          <w:b/>
+          <w:sz w:val="21"/>
+        </w:rPr>
+        <w:t xml:space="preserve">Figure 1B. </w:t>
+      </w:r>
+      <w:r>
+        <w:rPr>
+          <w:sz w:val="21"/>
+        </w:rPr>
+        <w:t>Volcano plot of differential expression, Advanced Fibrosis vs. Steatosis-only (GSE135251). log2 fold-changes are apeglm-shrunken DESeq2 estimates; the y-axis is the Benjamini-Hochberg-adjusted p-value. Dashed lines mark the pre-registered significance thresholds (padj &lt; 0.05, |log2FC| &gt; 1) used throughout this study.</w:t>
+      </w:r>
+    </w:p>
+    <w:p>
+      <w:pPr>
+        <w:jc w:val="center"/>
+      </w:pPr>
+      <w:r>
+        <w:drawing>
+          <wp:inline xmlns:a="http://schemas.openxmlformats.org/drawingml/2006/main" xmlns:pic="http://schemas.openxmlformats.org/drawingml/2006/picture">
+            <wp:extent cx="5760720" cy="7406640"/>
+            <wp:docPr id="3" name="Picture 3"/>
+            <wp:cNvGraphicFramePr>
+              <a:graphicFrameLocks noChangeAspect="1"/>
+            </wp:cNvGraphicFramePr>
+            <a:graphic>
+              <a:graphicData uri="http://schemas.openxmlformats.org/drawingml/2006/picture">
+                <pic:pic>
+                  <pic:nvPicPr>
+                    <pic:cNvPr id="0" name="f1c_heatmap_human.png"/>
+                    <pic:cNvPicPr/>
+                  </pic:nvPicPr>
+                  <pic:blipFill>
+                    <a:blip r:embed="rId11"/>
+                    <a:stretch>
+                      <a:fillRect/>
+                    </a:stretch>
+                  </pic:blipFill>
+                  <pic:spPr>
+                    <a:xfrm>
+                      <a:off x="0" y="0"/>
+                      <a:ext cx="5760720" cy="7406640"/>
+                    </a:xfrm>
+                    <a:prstGeom prst="rect"/>
+                  </pic:spPr>
+                </pic:pic>
+              </a:graphicData>
+            </a:graphic>
+          </wp:inline>
+        </w:drawing>
+      </w:r>
+    </w:p>
+    <w:p>
+      <w:pPr>
+        <w:spacing w:after="280"/>
+        <w:jc w:val="center"/>
+      </w:pPr>
+      <w:r>
+        <w:rPr>
+          <w:b/>
+          <w:sz w:val="21"/>
+        </w:rPr>
+        <w:t xml:space="preserve">Figure 1C. </w:t>
+      </w:r>
+      <w:r>
+        <w:rPr>
+          <w:sz w:val="21"/>
+        </w:rPr>
+        <w:t>Transcription factor activity across MASLD progression (GSE135251), restricted to TFs significantly associated with progression (one-way ANOVA on decoupleR univariate linear-model activity scores against the CollecTRI regulon, BH-adjusted p&lt;0.05; Methods 2.3-2.4). Values are row-wise z-scored group-mean activity; rows are hierarchically clustered (correlation distance, Ward.D2 linkage).</w:t>
+      </w:r>
+    </w:p>
+    <w:p>
+      <w:r>
+        <w:rPr>
+          <w:b/>
+          <w:i w:val="0"/>
+        </w:rPr>
+        <w:t>GSE222576 (mouse CCl4 time course):</w:t>
+      </w:r>
+    </w:p>
+    <w:p>
+      <w:pPr>
+        <w:jc w:val="center"/>
+      </w:pPr>
+      <w:r>
+        <w:drawing>
+          <wp:inline xmlns:a="http://schemas.openxmlformats.org/drawingml/2006/main" xmlns:pic="http://schemas.openxmlformats.org/drawingml/2006/picture">
+            <wp:extent cx="5760720" cy="4114800"/>
+            <wp:docPr id="4" name="Picture 4"/>
+            <wp:cNvGraphicFramePr>
+              <a:graphicFrameLocks noChangeAspect="1"/>
+            </wp:cNvGraphicFramePr>
+            <a:graphic>
+              <a:graphicData uri="http://schemas.openxmlformats.org/drawingml/2006/picture">
+                <pic:pic>
+                  <pic:nvPicPr>
+                    <pic:cNvPr id="0" name="f2a_pca_ccl4.png"/>
+                    <pic:cNvPicPr/>
+                  </pic:nvPicPr>
+                  <pic:blipFill>
+                    <a:blip r:embed="rId12"/>
+                    <a:stretch>
+                      <a:fillRect/>
+                    </a:stretch>
+                  </pic:blipFill>
+                  <pic:spPr>
+                    <a:xfrm>
+                      <a:off x="0" y="0"/>
+                      <a:ext cx="5760720" cy="4114800"/>
+                    </a:xfrm>
+                    <a:prstGeom prst="rect"/>
+                  </pic:spPr>
+                </pic:pic>
+              </a:graphicData>
+            </a:graphic>
+          </wp:inline>
+        </w:drawing>
+      </w:r>
+    </w:p>
+    <w:p>
+      <w:pPr>
+        <w:spacing w:after="280"/>
+        <w:jc w:val="center"/>
+      </w:pPr>
+      <w:r>
+        <w:rPr>
+          <w:b/>
+          <w:sz w:val="21"/>
+        </w:rPr>
+        <w:t xml:space="preserve">Figure 2A. </w:t>
+      </w:r>
+      <w:r>
+        <w:rPr>
+          <w:sz w:val="21"/>
+        </w:rPr>
+        <w:t>Principal component analysis of RMA-normalized expression values across the CCl4 time course (GSE222576, n=18; Control and 2/4/6/8/10 weeks, n=3/group).</w:t>
+      </w:r>
+    </w:p>
+    <w:p>
+      <w:pPr>
+        <w:jc w:val="center"/>
+      </w:pPr>
+      <w:r>
+        <w:drawing>
+          <wp:inline xmlns:a="http://schemas.openxmlformats.org/drawingml/2006/main" xmlns:pic="http://schemas.openxmlformats.org/drawingml/2006/picture">
+            <wp:extent cx="5760720" cy="5760720"/>
+            <wp:docPr id="5" name="Picture 5"/>
+            <wp:cNvGraphicFramePr>
+              <a:graphicFrameLocks noChangeAspect="1"/>
+            </wp:cNvGraphicFramePr>
+            <a:graphic>
+              <a:graphicData uri="http://schemas.openxmlformats.org/drawingml/2006/picture">
+                <pic:pic>
+                  <pic:nvPicPr>
+                    <pic:cNvPr id="0" name="f2b_volcano_ccl4.png"/>
+                    <pic:cNvPicPr/>
+                  </pic:nvPicPr>
+                  <pic:blipFill>
+                    <a:blip r:embed="rId13"/>
+                    <a:stretch>
+                      <a:fillRect/>
+                    </a:stretch>
+                  </pic:blipFill>
+                  <pic:spPr>
+                    <a:xfrm>
+                      <a:off x="0" y="0"/>
+                      <a:ext cx="5760720" cy="5760720"/>
+                    </a:xfrm>
+                    <a:prstGeom prst="rect"/>
+                  </pic:spPr>
+                </pic:pic>
+              </a:graphicData>
+            </a:graphic>
+          </wp:inline>
+        </w:drawing>
+      </w:r>
+    </w:p>
+    <w:p>
+      <w:pPr>
+        <w:spacing w:after="280"/>
+        <w:jc w:val="center"/>
+      </w:pPr>
+      <w:r>
+        <w:rPr>
+          <w:b/>
+          <w:sz w:val="21"/>
+        </w:rPr>
+        <w:t xml:space="preserve">Figure 2B. </w:t>
+      </w:r>
+      <w:r>
+        <w:rPr>
+          <w:sz w:val="21"/>
+        </w:rPr>
+        <w:t>Volcano plot of differential expression, CCl4 6 weeks vs. Control (GSE222576) -- the timepoint with the largest number of significant DEGs (Table 2). Statistics are limma/eBayes moderated t-test log-fold-changes and BH-adjusted p-values; dashed lines as in Figure 1B.</w:t>
+      </w:r>
+    </w:p>
+    <w:p>
+      <w:pPr>
+        <w:jc w:val="center"/>
+      </w:pPr>
+      <w:r>
+        <w:drawing>
+          <wp:inline xmlns:a="http://schemas.openxmlformats.org/drawingml/2006/main" xmlns:pic="http://schemas.openxmlformats.org/drawingml/2006/picture">
+            <wp:extent cx="5760720" cy="7406640"/>
+            <wp:docPr id="6" name="Picture 6"/>
+            <wp:cNvGraphicFramePr>
+              <a:graphicFrameLocks noChangeAspect="1"/>
+            </wp:cNvGraphicFramePr>
+            <a:graphic>
+              <a:graphicData uri="http://schemas.openxmlformats.org/drawingml/2006/picture">
+                <pic:pic>
+                  <pic:nvPicPr>
+                    <pic:cNvPr id="0" name="f2c_heatmap_ccl4.png"/>
+                    <pic:cNvPicPr/>
+                  </pic:nvPicPr>
+                  <pic:blipFill>
+                    <a:blip r:embed="rId14"/>
+                    <a:stretch>
+                      <a:fillRect/>
+                    </a:stretch>
+                  </pic:blipFill>
+                  <pic:spPr>
+                    <a:xfrm>
+                      <a:off x="0" y="0"/>
+                      <a:ext cx="5760720" cy="7406640"/>
+                    </a:xfrm>
+                    <a:prstGeom prst="rect"/>
+                  </pic:spPr>
+                </pic:pic>
+              </a:graphicData>
+            </a:graphic>
+          </wp:inline>
+        </w:drawing>
+      </w:r>
+    </w:p>
+    <w:p>
+      <w:pPr>
+        <w:spacing w:after="280"/>
+        <w:jc w:val="center"/>
+      </w:pPr>
+      <w:r>
+        <w:rPr>
+          <w:b/>
+          <w:sz w:val="21"/>
+        </w:rPr>
+        <w:t xml:space="preserve">Figure 2C. </w:t>
+      </w:r>
+      <w:r>
+        <w:rPr>
+          <w:sz w:val="21"/>
+        </w:rPr>
+        <w:t>Transcription factor activity across the CCl4 time course (GSE222576), restricted to significantly associated TFs (BH-adjusted p&lt;0.05); computed and displayed as in Figure 1C. Note the sharp peak in fibrogenic/EMT-associated TF activity at 6 weeks (Section 3.1).</w:t>
+      </w:r>
+    </w:p>
+    <w:p>
+      <w:r>
+        <w:rPr>
+          <w:b/>
+          <w:i w:val="0"/>
+        </w:rPr>
+        <w:t>GSE74605 (mouse TAA time course):</w:t>
+      </w:r>
+    </w:p>
+    <w:p>
+      <w:pPr>
+        <w:jc w:val="center"/>
+      </w:pPr>
+      <w:r>
+        <w:drawing>
+          <wp:inline xmlns:a="http://schemas.openxmlformats.org/drawingml/2006/main" xmlns:pic="http://schemas.openxmlformats.org/drawingml/2006/picture">
+            <wp:extent cx="5760720" cy="4114800"/>
+            <wp:docPr id="7" name="Picture 7"/>
+            <wp:cNvGraphicFramePr>
+              <a:graphicFrameLocks noChangeAspect="1"/>
+            </wp:cNvGraphicFramePr>
+            <a:graphic>
+              <a:graphicData uri="http://schemas.openxmlformats.org/drawingml/2006/picture">
+                <pic:pic>
+                  <pic:nvPicPr>
+                    <pic:cNvPr id="0" name="f3a_pca_taa.png"/>
+                    <pic:cNvPicPr/>
+                  </pic:nvPicPr>
+                  <pic:blipFill>
+                    <a:blip r:embed="rId15"/>
+                    <a:stretch>
+                      <a:fillRect/>
+                    </a:stretch>
+                  </pic:blipFill>
+                  <pic:spPr>
+                    <a:xfrm>
+                      <a:off x="0" y="0"/>
+                      <a:ext cx="5760720" cy="4114800"/>
+                    </a:xfrm>
+                    <a:prstGeom prst="rect"/>
+                  </pic:spPr>
+                </pic:pic>
+              </a:graphicData>
+            </a:graphic>
+          </wp:inline>
+        </w:drawing>
+      </w:r>
+    </w:p>
+    <w:p>
+      <w:pPr>
+        <w:spacing w:after="280"/>
+        <w:jc w:val="center"/>
+      </w:pPr>
+      <w:r>
+        <w:rPr>
+          <w:b/>
+          <w:sz w:val="21"/>
+        </w:rPr>
+        <w:t xml:space="preserve">Figure 3A. </w:t>
+      </w:r>
+      <w:r>
+        <w:rPr>
+          <w:sz w:val="21"/>
+        </w:rPr>
+        <w:t>Principal component analysis of quantile-normalized expression values across the TAA time course (GSE74605, n=13; Naive and 1/4/6 weeks, n=3-4/group).</w:t>
+      </w:r>
+    </w:p>
+    <w:p>
+      <w:pPr>
+        <w:jc w:val="center"/>
+      </w:pPr>
+      <w:r>
+        <w:drawing>
+          <wp:inline xmlns:a="http://schemas.openxmlformats.org/drawingml/2006/main" xmlns:pic="http://schemas.openxmlformats.org/drawingml/2006/picture">
+            <wp:extent cx="5760720" cy="5760720"/>
+            <wp:docPr id="8" name="Picture 8"/>
+            <wp:cNvGraphicFramePr>
+              <a:graphicFrameLocks noChangeAspect="1"/>
+            </wp:cNvGraphicFramePr>
+            <a:graphic>
+              <a:graphicData uri="http://schemas.openxmlformats.org/drawingml/2006/picture">
+                <pic:pic>
+                  <pic:nvPicPr>
+                    <pic:cNvPr id="0" name="f3b_volcano_taa.png"/>
+                    <pic:cNvPicPr/>
+                  </pic:nvPicPr>
+                  <pic:blipFill>
+                    <a:blip r:embed="rId16"/>
+                    <a:stretch>
+                      <a:fillRect/>
+                    </a:stretch>
+                  </pic:blipFill>
+                  <pic:spPr>
+                    <a:xfrm>
+                      <a:off x="0" y="0"/>
+                      <a:ext cx="5760720" cy="5760720"/>
+                    </a:xfrm>
+                    <a:prstGeom prst="rect"/>
+                  </pic:spPr>
+                </pic:pic>
+              </a:graphicData>
+            </a:graphic>
+          </wp:inline>
+        </w:drawing>
+      </w:r>
+    </w:p>
+    <w:p>
+      <w:pPr>
+        <w:spacing w:after="280"/>
+        <w:jc w:val="center"/>
+      </w:pPr>
+      <w:r>
+        <w:rPr>
+          <w:b/>
+          <w:sz w:val="21"/>
+        </w:rPr>
+        <w:t xml:space="preserve">Figure 3B. </w:t>
+      </w:r>
+      <w:r>
+        <w:rPr>
+          <w:sz w:val="21"/>
+        </w:rPr>
+        <w:t>Volcano plot of differential expression, TAA 6 weeks vs. Naive (GSE74605) -- the timepoint with the largest number of significant DEGs (Table 2). Statistics and thresholds as in Figure 2B.</w:t>
+      </w:r>
+    </w:p>
+    <w:p>
+      <w:pPr>
+        <w:jc w:val="center"/>
+      </w:pPr>
+      <w:r>
+        <w:drawing>
+          <wp:inline xmlns:a="http://schemas.openxmlformats.org/drawingml/2006/main" xmlns:pic="http://schemas.openxmlformats.org/drawingml/2006/picture">
+            <wp:extent cx="5760720" cy="7406640"/>
+            <wp:docPr id="9" name="Picture 9"/>
+            <wp:cNvGraphicFramePr>
+              <a:graphicFrameLocks noChangeAspect="1"/>
+            </wp:cNvGraphicFramePr>
+            <a:graphic>
+              <a:graphicData uri="http://schemas.openxmlformats.org/drawingml/2006/picture">
+                <pic:pic>
+                  <pic:nvPicPr>
+                    <pic:cNvPr id="0" name="f3c_heatmap_taa.png"/>
+                    <pic:cNvPicPr/>
+                  </pic:nvPicPr>
+                  <pic:blipFill>
+                    <a:blip r:embed="rId17"/>
+                    <a:stretch>
+                      <a:fillRect/>
+                    </a:stretch>
+                  </pic:blipFill>
+                  <pic:spPr>
+                    <a:xfrm>
+                      <a:off x="0" y="0"/>
+                      <a:ext cx="5760720" cy="7406640"/>
+                    </a:xfrm>
+                    <a:prstGeom prst="rect"/>
+                  </pic:spPr>
+                </pic:pic>
+              </a:graphicData>
+            </a:graphic>
+          </wp:inline>
+        </w:drawing>
+      </w:r>
+    </w:p>
+    <w:p>
+      <w:pPr>
+        <w:spacing w:after="280"/>
+        <w:jc w:val="center"/>
+      </w:pPr>
+      <w:r>
+        <w:rPr>
+          <w:b/>
+          <w:sz w:val="21"/>
+        </w:rPr>
+        <w:t xml:space="preserve">Figure 3C. </w:t>
+      </w:r>
+      <w:r>
+        <w:rPr>
+          <w:sz w:val="21"/>
+        </w:rPr>
+        <w:t>Transcription factor activity across the TAA time course (GSE74605), restricted to significantly associated TFs (BH-adjusted p&lt;0.05); computed and displayed as in Figure 1C. The TGF-β/SMAD cluster (Smad1/4/5/9) increasing monotonically with duration of exposure (Section 3.1) is visible here.</w:t>
       </w:r>
     </w:p>
     <w:p>
@@ -1310,7 +1895,25 @@
           <w:b w:val="0"/>
           <w:i w:val="0"/>
         </w:rPr>
-        <w:t>After ortholog-based matching (Methods 2.5), 499 TFs were testable in all three datasets. Of these, 449 reached a nominally significant Fisher-combined p-value, but only 101 were independently significant in all three datasets, and 54 additionally satisfied the direction-concordance criterion, forming the consensus set used for downstream prioritization (Figure 1; full list in Supplementary Table S1). The top 15 consensus TFs by Fisher-combined p-value are shown in Table 3 and were identical, at this rank, to those obtained using a simpler symbol-case-conversion match (Methods 2.5; Section 3.2 note below), indicating the headline result is not an artifact of the matching method.</w:t>
+        <w:t>After ortholog-based matching (Methods 2.5), 499 TFs were testable in all three datasets. Of these, 449 reached a nominally significant Fisher-combined p-value, but only 101 were independently significant in all three datasets, and 54 additionally satisfied the direction-concordance criterion, forming the consensus set used for downstream prioritization (Figure 4A; full list in Supplementary Table S1). The top 15 consensus TFs by Fisher-combined p-value are shown in Table 3 and were identical, at this rank, to those obtained using a simpler symbol-case-conversion match (Methods 2.5; Section 3.2 note below), indicating the headline result is not an artifact of the matching method.</w:t>
+      </w:r>
+    </w:p>
+    <w:p>
+      <w:pPr>
+        <w:spacing w:before="200" w:after="80"/>
+      </w:pPr>
+      <w:r>
+        <w:rPr>
+          <w:b/>
+          <w:sz w:val="21"/>
+        </w:rPr>
+        <w:t xml:space="preserve">Table 3. </w:t>
+      </w:r>
+      <w:r>
+        <w:rPr>
+          <w:sz w:val="21"/>
+        </w:rPr>
+        <w:t>Top 15 consensus transcription factors, ranked by Fisher-combined padj.</w:t>
       </w:r>
     </w:p>
     <w:tbl>
@@ -2919,6 +3522,64 @@
     </w:p>
     <w:p>
       <w:pPr>
+        <w:jc w:val="center"/>
+      </w:pPr>
+      <w:r>
+        <w:drawing>
+          <wp:inline xmlns:a="http://schemas.openxmlformats.org/drawingml/2006/main" xmlns:pic="http://schemas.openxmlformats.org/drawingml/2006/picture">
+            <wp:extent cx="5760720" cy="3456432"/>
+            <wp:docPr id="10" name="Picture 10"/>
+            <wp:cNvGraphicFramePr>
+              <a:graphicFrameLocks noChangeAspect="1"/>
+            </wp:cNvGraphicFramePr>
+            <a:graphic>
+              <a:graphicData uri="http://schemas.openxmlformats.org/drawingml/2006/picture">
+                <pic:pic>
+                  <pic:nvPicPr>
+                    <pic:cNvPr id="0" name="fig1_bar.png"/>
+                    <pic:cNvPicPr/>
+                  </pic:nvPicPr>
+                  <pic:blipFill>
+                    <a:blip r:embed="rId18"/>
+                    <a:stretch>
+                      <a:fillRect/>
+                    </a:stretch>
+                  </pic:blipFill>
+                  <pic:spPr>
+                    <a:xfrm>
+                      <a:off x="0" y="0"/>
+                      <a:ext cx="5760720" cy="3456432"/>
+                    </a:xfrm>
+                    <a:prstGeom prst="rect"/>
+                  </pic:spPr>
+                </pic:pic>
+              </a:graphicData>
+            </a:graphic>
+          </wp:inline>
+        </w:drawing>
+      </w:r>
+    </w:p>
+    <w:p>
+      <w:pPr>
+        <w:spacing w:after="280"/>
+        <w:jc w:val="center"/>
+      </w:pPr>
+      <w:r>
+        <w:rPr>
+          <w:b/>
+          <w:sz w:val="21"/>
+        </w:rPr>
+        <w:t xml:space="preserve">Figure 4A. </w:t>
+      </w:r>
+      <w:r>
+        <w:rPr>
+          <w:sz w:val="21"/>
+        </w:rPr>
+        <w:t>Statistical significance of the top 15 consensus transcription factors in each of the three datasets. Bars show -log10(BH-adjusted p-value) within each dataset, computed from the within-dataset ANOVA described in Methods 2.4 (BH correction applied separately per dataset); the dashed line marks padj = 0.05. Every bar for every listed TF clears the significance threshold in all three datasets independently.</w:t>
+      </w:r>
+    </w:p>
+    <w:p>
+      <w:pPr>
         <w:pStyle w:val="Heading2"/>
       </w:pPr>
       <w:r>
@@ -2932,6 +3593,64 @@
           <w:i w:val="0"/>
         </w:rPr>
         <w:t>Three of the top 15 consensus TFs are direct components of the canonical TGF-β/SMAD signaling axis: SMAD3, the principal pro-fibrotic effector of TGF-β receptor signaling, increased with fibrosis progression in all three datasets, while SMAD6 and SMAD7, both negative-feedback inhibitors of the same pathway, decreased with progression in all three datasets. This pattern -- loss of pathway-intrinsic negative feedback occurring together with increased activity of the pro-fibrotic effector -- constitutes a mechanistically self-consistent signature that was recovered independently, without pathway-level supervision, in a human metabolic-disease cohort and two mechanistically distinct mouse chemical-injury models, supporting the biological validity of the consensus-filtering approach.</w:t>
+      </w:r>
+    </w:p>
+    <w:p>
+      <w:pPr>
+        <w:jc w:val="center"/>
+      </w:pPr>
+      <w:r>
+        <w:drawing>
+          <wp:inline xmlns:a="http://schemas.openxmlformats.org/drawingml/2006/main" xmlns:pic="http://schemas.openxmlformats.org/drawingml/2006/picture">
+            <wp:extent cx="5760720" cy="3142211"/>
+            <wp:docPr id="11" name="Picture 11"/>
+            <wp:cNvGraphicFramePr>
+              <a:graphicFrameLocks noChangeAspect="1"/>
+            </wp:cNvGraphicFramePr>
+            <a:graphic>
+              <a:graphicData uri="http://schemas.openxmlformats.org/drawingml/2006/picture">
+                <pic:pic>
+                  <pic:nvPicPr>
+                    <pic:cNvPr id="0" name="fig2_heatmap.png"/>
+                    <pic:cNvPicPr/>
+                  </pic:nvPicPr>
+                  <pic:blipFill>
+                    <a:blip r:embed="rId19"/>
+                    <a:stretch>
+                      <a:fillRect/>
+                    </a:stretch>
+                  </pic:blipFill>
+                  <pic:spPr>
+                    <a:xfrm>
+                      <a:off x="0" y="0"/>
+                      <a:ext cx="5760720" cy="3142211"/>
+                    </a:xfrm>
+                    <a:prstGeom prst="rect"/>
+                  </pic:spPr>
+                </pic:pic>
+              </a:graphicData>
+            </a:graphic>
+          </wp:inline>
+        </w:drawing>
+      </w:r>
+    </w:p>
+    <w:p>
+      <w:pPr>
+        <w:spacing w:after="280"/>
+        <w:jc w:val="center"/>
+      </w:pPr>
+      <w:r>
+        <w:rPr>
+          <w:b/>
+          <w:sz w:val="21"/>
+        </w:rPr>
+        <w:t xml:space="preserve">Figure 4B. </w:t>
+      </w:r>
+      <w:r>
+        <w:rPr>
+          <w:sz w:val="21"/>
+        </w:rPr>
+        <w:t>Activity of the top 15 consensus transcription factors across all three datasets, arranged by disease/injury progression (left to right within each block: human Normal-to-Advanced Fibrosis; mouse CCl4 Control-to-10 weeks; mouse TAA Naive-to-6 weeks). Color scale is a row-wise z-score computed independently within each dataset (Methods 2.6) to prevent the platform with the larger absolute activity range from dominating the display. The SMAD6/SMAD7/SMAD3 pattern described in Section 3.3 is visible as the top and bottom row clusters, respectively.</w:t>
       </w:r>
     </w:p>
     <w:p>
@@ -2974,7 +3693,25 @@
           <w:b w:val="0"/>
           <w:i w:val="0"/>
         </w:rPr>
-        <w:t>A systematic literature re-verification (Methods 2.6), however, showed that ARID1A is not uncharacterized in the liver as initially assumed. Hepatocyte-specific Arid1a-knockout mice develop worse high-fat-diet-induced steatosis and fibrosis (Moore et al., Hepatology 2019), and Arid1a mutation suppresses protective TGF-β-Smad4 signaling in cholangiocytes, promoting cholangiocarcinoma (Guo et al., Cell Reports 2022) -- both findings indicate a protective role for ARID1A in liver epithelial cells (hepatocytes, cholangiocytes), the opposite of a simple "ARID1A promotes fibrosis" reading. Our own data show ARID1A activity increasing with fibrosis progression in all three datasets (concordant direction = +1), which is compatible with either (i) a bulk-tissue cell-composition confound, in which the rising fraction of activated HSCs in whole-tissue RNA as fibrosis progresses inflates the apparent activity of any HSC-enriched regulon target set independent of any true regulatory change, or (ii) a genuine, cell-type-opposite function, whereby ARID1A is protective in hepatocytes/cholangiocytes but pro-fibrotic when acting cell-autonomously within HSCs. Critically, neither published study tested ARID1A directly in HSCs, leaving this specific, narrower question open and experimentally tractable (Section 5).</w:t>
+        <w:t>A systematic literature re-verification (Methods 2.6), however, showed that ARID1A is not uncharacterized in the liver as initially assumed. Hepatocyte-specific Arid1a-knockout mice develop worse high-fat-diet-induced steatosis and fibrosis (Moore et al., Hepatology 2019), and Arid1a mutation suppresses protective TGF-β-Smad4 signaling in cholangiocytes, promoting cholangiocarcinoma (Guo et al., Cell Reports 2022) -- both findings indicate a protective role for ARID1A in liver epithelial cells (hepatocytes, cholangiocytes), the opposite of a simple "ARID1A promotes fibrosis" reading. Our own data show ARID1A activity increasing with fibrosis progression in all three datasets (concordant direction = +1), which is compatible with either (i) a bulk-tissue cell-composition confound, in which the rising fraction of activated HSCs in whole-tissue RNA as fibrosis progresses inflates the apparent activity of any HSC-enriched regulon target set independent of any true regulatory change, or (ii) a genuine, cell-type-opposite function, whereby ARID1A is protective in hepatocytes/cholangiocytes but pro-fibrotic when acting cell-autonomously within HSCs. Critically, neither published study tested ARID1A directly in HSCs, leaving this specific, narrower question open and experimentally tractable (Section 6).</w:t>
+      </w:r>
+    </w:p>
+    <w:p>
+      <w:pPr>
+        <w:spacing w:before="200" w:after="80"/>
+      </w:pPr>
+      <w:r>
+        <w:rPr>
+          <w:b/>
+          <w:sz w:val="21"/>
+        </w:rPr>
+        <w:t xml:space="preserve">Table 4. </w:t>
+      </w:r>
+      <w:r>
+        <w:rPr>
+          <w:sz w:val="21"/>
+        </w:rPr>
+        <w:t>Existing literature evidence for SMARCA4 and ARID1A, by cell type.</w:t>
       </w:r>
     </w:p>
     <w:tbl>
@@ -3358,7 +4095,7 @@
           <w:b w:val="0"/>
           <w:i w:val="0"/>
         </w:rPr>
-        <w:t>All analysis code, intermediate result files, figures, the full 54-TF consensus table, the literature/druggability triage, and the experimental validation plan are publicly available at github.com/bioinform25/pharmacology2254. Public datasets analyzed are available from GEO under accessions GSE135251, GSE222576, and GSE74605.</w:t>
+        <w:t>All analysis code, intermediate result files, figures, the full 54-TF consensus table, the literature/druggability triage, and the experimental validation plan are publicly available at github.com/bioinform25/pharmacology2254. Public datasets analyzed are available from GEO under accessions GSE135251, GSE222576, and GSE74605. Figures 1B/2B/3B show one representative differential-expression contrast per dataset (the one with the most significant DEGs); volcano plots for every individual timepoint contrast (2/4/6/8/10 weeks for GSE222576; 1/4/6 weeks for GSE74605; both GSE135251 contrasts) are provided as individual PDF files under each dataset's figures/ directory in the repository.</w:t>
       </w:r>
     </w:p>
     <w:p>

</xml_diff>